<commit_message>
Update DWEC submodule reference and add dirty flag to the commit
</commit_message>
<xml_diff>
--- a/asignaturas/EIE/Trámite de la puesta en marcha.docx
+++ b/asignaturas/EIE/Trámite de la puesta en marcha.docx
@@ -17,7 +17,6 @@
       </w:sdtPr>
       <w:sdtEndPr>
         <w:rPr>
-          <w:rFonts w:asciiTheme="minorHAnsi" w:hAnsiTheme="minorHAnsi" w:cstheme="minorBidi"/>
           <w:color w:val="auto"/>
         </w:rPr>
       </w:sdtEndPr>
@@ -25,7 +24,7 @@
         <w:p>
           <w:pPr>
             <w:pStyle w:val="Sinespaciado"/>
-            <w:spacing w:before="1540" w:after="240"/>
+            <w:spacing w:before="1540" w:after="240" w:line="360" w:lineRule="auto"/>
             <w:jc w:val="center"/>
             <w:rPr>
               <w:rFonts w:ascii="Times New Roman" w:hAnsi="Times New Roman" w:cs="Times New Roman"/>
@@ -124,7 +123,7 @@
                   <w:top w:val="single" w:sz="6" w:space="6" w:color="4472C4" w:themeColor="accent1"/>
                   <w:bottom w:val="single" w:sz="6" w:space="6" w:color="4472C4" w:themeColor="accent1"/>
                 </w:pBdr>
-                <w:spacing w:after="240"/>
+                <w:spacing w:after="240" w:line="360" w:lineRule="auto"/>
                 <w:jc w:val="center"/>
                 <w:rPr>
                   <w:rFonts w:ascii="Times New Roman" w:eastAsiaTheme="majorEastAsia" w:hAnsi="Times New Roman" w:cs="Times New Roman"/>
@@ -170,6 +169,7 @@
             <w:p>
               <w:pPr>
                 <w:pStyle w:val="Sinespaciado"/>
+                <w:spacing w:line="360" w:lineRule="auto"/>
                 <w:jc w:val="center"/>
                 <w:rPr>
                   <w:rFonts w:ascii="Times New Roman" w:hAnsi="Times New Roman" w:cs="Times New Roman"/>
@@ -193,7 +193,7 @@
         <w:p>
           <w:pPr>
             <w:pStyle w:val="Sinespaciado"/>
-            <w:spacing w:before="480"/>
+            <w:spacing w:before="480" w:line="360" w:lineRule="auto"/>
             <w:jc w:val="center"/>
             <w:rPr>
               <w:rFonts w:ascii="Times New Roman" w:hAnsi="Times New Roman" w:cs="Times New Roman"/>
@@ -580,6 +580,7 @@
         </w:p>
         <w:p>
           <w:pPr>
+            <w:spacing w:line="360" w:lineRule="auto"/>
             <w:rPr>
               <w:rFonts w:ascii="Times New Roman" w:hAnsi="Times New Roman" w:cs="Times New Roman"/>
               <w:u w:val="single"/>
@@ -595,6 +596,8 @@
         </w:p>
         <w:p>
           <w:pPr>
+            <w:pStyle w:val="Prrafodelista"/>
+            <w:spacing w:line="360" w:lineRule="auto"/>
             <w:jc w:val="both"/>
             <w:rPr>
               <w:rFonts w:ascii="Times New Roman" w:hAnsi="Times New Roman" w:cs="Times New Roman"/>
@@ -605,45 +608,26 @@
               <w:rFonts w:ascii="Times New Roman" w:hAnsi="Times New Roman" w:cs="Times New Roman"/>
             </w:rPr>
             <w:lastRenderedPageBreak/>
-            <w:t>Los tramites de la constitución son necesario par</w:t>
-          </w:r>
-          <w:r>
-            <w:rPr>
-              <w:rFonts w:ascii="Times New Roman" w:hAnsi="Times New Roman" w:cs="Times New Roman"/>
-            </w:rPr>
-            <w:t xml:space="preserve">a </w:t>
-          </w:r>
-          <w:r>
-            <w:rPr>
-              <w:rFonts w:ascii="Times New Roman" w:hAnsi="Times New Roman" w:cs="Times New Roman"/>
-            </w:rPr>
-            <w:t xml:space="preserve">que la empresa pueda acceder una personalidad jurídica. </w:t>
-          </w:r>
-        </w:p>
-        <w:p>
-          <w:pPr>
-            <w:jc w:val="both"/>
-            <w:rPr>
-              <w:rFonts w:ascii="Times New Roman" w:hAnsi="Times New Roman" w:cs="Times New Roman"/>
-            </w:rPr>
-          </w:pPr>
-          <w:r>
-            <w:rPr>
-              <w:rFonts w:ascii="Times New Roman" w:hAnsi="Times New Roman" w:cs="Times New Roman"/>
-            </w:rPr>
-            <w:t>Los trámites</w:t>
-          </w:r>
-          <w:r>
-            <w:rPr>
-              <w:rFonts w:ascii="Times New Roman" w:hAnsi="Times New Roman" w:cs="Times New Roman"/>
-            </w:rPr>
-            <w:t xml:space="preserve"> previos</w:t>
-          </w:r>
-          <w:r>
-            <w:rPr>
-              <w:rFonts w:ascii="Times New Roman" w:hAnsi="Times New Roman" w:cs="Times New Roman"/>
-            </w:rPr>
-            <w:t xml:space="preserve"> necesarios que se requieren serán los siguientes:</w:t>
+            <w:t xml:space="preserve">Con el objetivo de construir formalmente la empresa </w:t>
+          </w:r>
+          <w:r>
+            <w:rPr>
+              <w:rFonts w:ascii="Times New Roman" w:hAnsi="Times New Roman" w:cs="Times New Roman"/>
+              <w:b/>
+            </w:rPr>
+            <w:t>Lemon SL</w:t>
+          </w:r>
+          <w:r>
+            <w:rPr>
+              <w:rFonts w:ascii="Times New Roman" w:hAnsi="Times New Roman" w:cs="Times New Roman"/>
+            </w:rPr>
+            <w:t>, se deberá proceder con los siguientes requisitos legales en España. A posteriori d</w:t>
+          </w:r>
+          <w:r>
+            <w:rPr>
+              <w:rFonts w:ascii="Times New Roman" w:hAnsi="Times New Roman" w:cs="Times New Roman"/>
+            </w:rPr>
+            <w:t xml:space="preserve">escribiremos los procesos que la empresa debe proceder: </w:t>
           </w:r>
         </w:p>
         <w:p>
@@ -651,22 +635,778 @@
             <w:pStyle w:val="Prrafodelista"/>
             <w:numPr>
               <w:ilvl w:val="0"/>
-              <w:numId w:val="6"/>
+              <w:numId w:val="7"/>
             </w:numPr>
+            <w:spacing w:line="360" w:lineRule="auto"/>
             <w:jc w:val="both"/>
             <w:rPr>
               <w:rFonts w:ascii="Times New Roman" w:hAnsi="Times New Roman" w:cs="Times New Roman"/>
+              <w:b/>
+              <w:i/>
             </w:rPr>
           </w:pPr>
           <w:r>
             <w:rPr>
               <w:rFonts w:ascii="Times New Roman" w:hAnsi="Times New Roman" w:cs="Times New Roman"/>
-            </w:rPr>
-            <w:t xml:space="preserve">La obtención de certificación del nombre de Lemon SL, tras haber obtenido el certificado habiendo previamente pagado las tasas correspondientes entre 10 y 20 € </w:t>
+              <w:b/>
+              <w:i/>
+            </w:rPr>
+            <w:t>Definición de la actividad Empresarial y Objetivos</w:t>
           </w:r>
         </w:p>
-        <w:bookmarkStart w:id="0" w:name="_GoBack" w:displacedByCustomXml="next"/>
-        <w:bookmarkEnd w:id="0" w:displacedByCustomXml="next"/>
+        <w:p>
+          <w:pPr>
+            <w:pStyle w:val="Prrafodelista"/>
+            <w:spacing w:line="360" w:lineRule="auto"/>
+            <w:ind w:left="1080"/>
+            <w:jc w:val="both"/>
+            <w:rPr>
+              <w:rFonts w:ascii="Times New Roman" w:hAnsi="Times New Roman" w:cs="Times New Roman"/>
+              <w:b/>
+              <w:i/>
+            </w:rPr>
+          </w:pPr>
+        </w:p>
+        <w:p>
+          <w:pPr>
+            <w:pStyle w:val="Prrafodelista"/>
+            <w:numPr>
+              <w:ilvl w:val="0"/>
+              <w:numId w:val="7"/>
+            </w:numPr>
+            <w:spacing w:line="360" w:lineRule="auto"/>
+            <w:jc w:val="both"/>
+            <w:rPr>
+              <w:rFonts w:ascii="Times New Roman" w:hAnsi="Times New Roman" w:cs="Times New Roman"/>
+              <w:b/>
+              <w:i/>
+            </w:rPr>
+          </w:pPr>
+          <w:r>
+            <w:rPr>
+              <w:rFonts w:ascii="Times New Roman" w:hAnsi="Times New Roman" w:cs="Times New Roman"/>
+              <w:b/>
+              <w:i/>
+            </w:rPr>
+            <w:t>Solicitud del Certificado Negativo de Denominación Social</w:t>
+          </w:r>
+        </w:p>
+        <w:p>
+          <w:pPr>
+            <w:pStyle w:val="Prrafodelista"/>
+            <w:spacing w:line="360" w:lineRule="auto"/>
+            <w:ind w:left="1080"/>
+            <w:jc w:val="both"/>
+            <w:rPr>
+              <w:rFonts w:ascii="Times New Roman" w:hAnsi="Times New Roman" w:cs="Times New Roman"/>
+            </w:rPr>
+          </w:pPr>
+          <w:r>
+            <w:rPr>
+              <w:rFonts w:ascii="Times New Roman" w:hAnsi="Times New Roman" w:cs="Times New Roman"/>
+            </w:rPr>
+            <w:t xml:space="preserve">El primer tramite que se va a solicitar es el </w:t>
+          </w:r>
+          <w:r>
+            <w:rPr>
+              <w:rFonts w:ascii="Times New Roman" w:hAnsi="Times New Roman" w:cs="Times New Roman"/>
+              <w:i/>
+            </w:rPr>
+            <w:t>Certificado Negativo de Denominación</w:t>
+          </w:r>
+          <w:r>
+            <w:rPr>
+              <w:rFonts w:ascii="Times New Roman" w:hAnsi="Times New Roman" w:cs="Times New Roman"/>
+            </w:rPr>
+            <w:t xml:space="preserve"> social en el </w:t>
+          </w:r>
+          <w:r>
+            <w:rPr>
+              <w:rFonts w:ascii="Times New Roman" w:hAnsi="Times New Roman" w:cs="Times New Roman"/>
+              <w:i/>
+            </w:rPr>
+            <w:t>Registro Mercantil Central</w:t>
+          </w:r>
+          <w:r>
+            <w:rPr>
+              <w:rFonts w:ascii="Times New Roman" w:hAnsi="Times New Roman" w:cs="Times New Roman"/>
+              <w:i/>
+            </w:rPr>
+            <w:t>.</w:t>
+          </w:r>
+          <w:r>
+            <w:rPr>
+              <w:rFonts w:ascii="Times New Roman" w:hAnsi="Times New Roman" w:cs="Times New Roman"/>
+            </w:rPr>
+            <w:t xml:space="preserve"> Este documento garantizará que el nombre </w:t>
+          </w:r>
+          <w:r>
+            <w:rPr>
+              <w:rFonts w:ascii="Times New Roman" w:hAnsi="Times New Roman" w:cs="Times New Roman"/>
+              <w:b/>
+            </w:rPr>
+            <w:t>Lemon SL</w:t>
+          </w:r>
+          <w:r>
+            <w:rPr>
+              <w:rFonts w:ascii="Times New Roman" w:hAnsi="Times New Roman" w:cs="Times New Roman"/>
+            </w:rPr>
+            <w:t xml:space="preserve"> no está registrado previamente. Este certificado tiene una validez de seis meses, tiempo en el cual se debe c</w:t>
+          </w:r>
+          <w:r>
+            <w:rPr>
+              <w:rFonts w:ascii="Times New Roman" w:hAnsi="Times New Roman" w:cs="Times New Roman"/>
+            </w:rPr>
+            <w:t xml:space="preserve">ompletar </w:t>
+          </w:r>
+        </w:p>
+        <w:p>
+          <w:pPr>
+            <w:pStyle w:val="Prrafodelista"/>
+            <w:numPr>
+              <w:ilvl w:val="0"/>
+              <w:numId w:val="7"/>
+            </w:numPr>
+            <w:spacing w:line="360" w:lineRule="auto"/>
+            <w:jc w:val="both"/>
+            <w:rPr>
+              <w:rFonts w:ascii="Times New Roman" w:hAnsi="Times New Roman" w:cs="Times New Roman"/>
+              <w:b/>
+              <w:i/>
+            </w:rPr>
+          </w:pPr>
+          <w:r>
+            <w:rPr>
+              <w:rFonts w:ascii="Times New Roman" w:hAnsi="Times New Roman" w:cs="Times New Roman"/>
+              <w:b/>
+              <w:i/>
+            </w:rPr>
+            <w:t>Redacción de los Estatutos Sociales</w:t>
+          </w:r>
+        </w:p>
+        <w:p>
+          <w:pPr>
+            <w:pStyle w:val="Prrafodelista"/>
+            <w:spacing w:line="360" w:lineRule="auto"/>
+            <w:ind w:left="1080"/>
+            <w:jc w:val="both"/>
+            <w:rPr>
+              <w:rFonts w:ascii="Times New Roman" w:hAnsi="Times New Roman" w:cs="Times New Roman"/>
+            </w:rPr>
+          </w:pPr>
+          <w:r>
+            <w:rPr>
+              <w:rFonts w:ascii="Times New Roman" w:hAnsi="Times New Roman" w:cs="Times New Roman"/>
+            </w:rPr>
+            <w:t xml:space="preserve">Confirmada el nombre de la </w:t>
+          </w:r>
+          <w:r>
+            <w:rPr>
+              <w:rFonts w:ascii="Times New Roman" w:hAnsi="Times New Roman" w:cs="Times New Roman"/>
+              <w:b/>
+            </w:rPr>
+            <w:t>Lemon SL</w:t>
+          </w:r>
+          <w:r>
+            <w:rPr>
+              <w:rFonts w:ascii="Times New Roman" w:hAnsi="Times New Roman" w:cs="Times New Roman"/>
+            </w:rPr>
+            <w:t xml:space="preserve">, se procederá a la redacción de los </w:t>
+          </w:r>
+          <w:r>
+            <w:rPr>
+              <w:rFonts w:ascii="Times New Roman" w:hAnsi="Times New Roman" w:cs="Times New Roman"/>
+              <w:i/>
+            </w:rPr>
+            <w:t xml:space="preserve">Estatutos Sociales. </w:t>
+          </w:r>
+          <w:r>
+            <w:rPr>
+              <w:rFonts w:ascii="Times New Roman" w:hAnsi="Times New Roman" w:cs="Times New Roman"/>
+            </w:rPr>
+            <w:t xml:space="preserve">Esos documentos deben detallar aspectos clave, como el objeto social, el domicilio de la empresa, la estructura del capital social, las funciones y poderes de los administradores. Es recomendable contar de la existencia de un abogado o notario garantizando </w:t>
+          </w:r>
+          <w:r>
+            <w:rPr>
+              <w:rFonts w:ascii="Times New Roman" w:hAnsi="Times New Roman" w:cs="Times New Roman"/>
+            </w:rPr>
+            <w:t>que los estatutos cumplan con la legislación vigente.</w:t>
+          </w:r>
+        </w:p>
+        <w:p>
+          <w:pPr>
+            <w:pStyle w:val="Prrafodelista"/>
+            <w:numPr>
+              <w:ilvl w:val="0"/>
+              <w:numId w:val="7"/>
+            </w:numPr>
+            <w:spacing w:line="360" w:lineRule="auto"/>
+            <w:jc w:val="both"/>
+            <w:rPr>
+              <w:rFonts w:ascii="Times New Roman" w:hAnsi="Times New Roman" w:cs="Times New Roman"/>
+              <w:b/>
+              <w:i/>
+            </w:rPr>
+          </w:pPr>
+          <w:r>
+            <w:rPr>
+              <w:rFonts w:ascii="Times New Roman" w:hAnsi="Times New Roman" w:cs="Times New Roman"/>
+              <w:b/>
+              <w:i/>
+            </w:rPr>
+            <w:t>Aportación del Capital Social</w:t>
+          </w:r>
+        </w:p>
+        <w:p>
+          <w:pPr>
+            <w:pStyle w:val="Prrafodelista"/>
+            <w:spacing w:line="360" w:lineRule="auto"/>
+            <w:ind w:left="1080"/>
+            <w:jc w:val="both"/>
+            <w:rPr>
+              <w:rFonts w:ascii="Times New Roman" w:hAnsi="Times New Roman" w:cs="Times New Roman"/>
+              <w:i/>
+            </w:rPr>
+          </w:pPr>
+          <w:r>
+            <w:rPr>
+              <w:rFonts w:ascii="Times New Roman" w:hAnsi="Times New Roman" w:cs="Times New Roman"/>
+            </w:rPr>
+            <w:t xml:space="preserve">El capital </w:t>
+          </w:r>
+          <w:r>
+            <w:rPr>
+              <w:rFonts w:ascii="Times New Roman" w:hAnsi="Times New Roman" w:cs="Times New Roman"/>
+            </w:rPr>
+            <w:t xml:space="preserve">social mínimo </w:t>
+          </w:r>
+          <w:r>
+            <w:rPr>
+              <w:rFonts w:ascii="Times New Roman" w:hAnsi="Times New Roman" w:cs="Times New Roman"/>
+            </w:rPr>
+            <w:t xml:space="preserve">necesario para construir </w:t>
+          </w:r>
+          <w:r>
+            <w:rPr>
+              <w:rFonts w:ascii="Times New Roman" w:hAnsi="Times New Roman" w:cs="Times New Roman"/>
+              <w:b/>
+            </w:rPr>
+            <w:t>Lemon SL</w:t>
+          </w:r>
+          <w:r>
+            <w:rPr>
+              <w:rFonts w:ascii="Times New Roman" w:hAnsi="Times New Roman" w:cs="Times New Roman"/>
+              <w:b/>
+            </w:rPr>
+            <w:t xml:space="preserve"> </w:t>
+          </w:r>
+          <w:r>
+            <w:rPr>
+              <w:rFonts w:ascii="Times New Roman" w:hAnsi="Times New Roman" w:cs="Times New Roman"/>
+            </w:rPr>
+            <w:t xml:space="preserve">será de 52.000€. El capital será ingresado en </w:t>
+          </w:r>
+          <w:r>
+            <w:rPr>
+              <w:rFonts w:ascii="Times New Roman" w:hAnsi="Times New Roman" w:cs="Times New Roman"/>
+            </w:rPr>
+            <w:t xml:space="preserve">la cuenta bancaria. El banco emitirá un </w:t>
+          </w:r>
+          <w:r>
+            <w:rPr>
+              <w:rFonts w:ascii="Times New Roman" w:hAnsi="Times New Roman" w:cs="Times New Roman"/>
+              <w:b/>
+              <w:i/>
+            </w:rPr>
+            <w:t>certificado de aportación del capital</w:t>
+          </w:r>
+          <w:r>
+            <w:rPr>
+              <w:rFonts w:ascii="Times New Roman" w:hAnsi="Times New Roman" w:cs="Times New Roman"/>
+            </w:rPr>
+            <w:t>, el cual será indispensable</w:t>
+          </w:r>
+          <w:r>
+            <w:rPr>
+              <w:rFonts w:ascii="Times New Roman" w:hAnsi="Times New Roman" w:cs="Times New Roman"/>
+            </w:rPr>
+            <w:t xml:space="preserve"> para la firma </w:t>
+          </w:r>
+          <w:r>
+            <w:rPr>
+              <w:rFonts w:ascii="Times New Roman" w:hAnsi="Times New Roman" w:cs="Times New Roman"/>
+            </w:rPr>
+            <w:t>de la escritura de constitución ante notario.</w:t>
+          </w:r>
+          <w:r>
+            <w:rPr>
+              <w:rFonts w:ascii="Times New Roman" w:hAnsi="Times New Roman" w:cs="Times New Roman"/>
+            </w:rPr>
+            <w:t xml:space="preserve"> </w:t>
+          </w:r>
+        </w:p>
+        <w:p>
+          <w:pPr>
+            <w:pStyle w:val="Prrafodelista"/>
+            <w:numPr>
+              <w:ilvl w:val="0"/>
+              <w:numId w:val="7"/>
+            </w:numPr>
+            <w:spacing w:line="360" w:lineRule="auto"/>
+            <w:jc w:val="both"/>
+            <w:rPr>
+              <w:rFonts w:ascii="Times New Roman" w:hAnsi="Times New Roman" w:cs="Times New Roman"/>
+              <w:b/>
+              <w:i/>
+            </w:rPr>
+          </w:pPr>
+          <w:r>
+            <w:rPr>
+              <w:rFonts w:ascii="Times New Roman" w:hAnsi="Times New Roman" w:cs="Times New Roman"/>
+              <w:b/>
+              <w:i/>
+            </w:rPr>
+            <w:t>Firma de la Escritura de Constitución</w:t>
+          </w:r>
+        </w:p>
+        <w:p>
+          <w:pPr>
+            <w:pStyle w:val="Prrafodelista"/>
+            <w:spacing w:line="360" w:lineRule="auto"/>
+            <w:ind w:left="1080"/>
+            <w:jc w:val="both"/>
+            <w:rPr>
+              <w:rFonts w:ascii="Times New Roman" w:hAnsi="Times New Roman" w:cs="Times New Roman"/>
+            </w:rPr>
+          </w:pPr>
+          <w:r>
+            <w:rPr>
+              <w:rFonts w:ascii="Times New Roman" w:hAnsi="Times New Roman" w:cs="Times New Roman"/>
+            </w:rPr>
+            <w:t xml:space="preserve">Con los estatutos redactados y el capital aportado, se deberá acudir a una notaria para firmar la </w:t>
+          </w:r>
+          <w:r>
+            <w:rPr>
+              <w:rFonts w:ascii="Times New Roman" w:hAnsi="Times New Roman" w:cs="Times New Roman"/>
+              <w:b/>
+              <w:i/>
+            </w:rPr>
+            <w:t xml:space="preserve">escritura pública de constitución. </w:t>
+          </w:r>
+          <w:r>
+            <w:rPr>
+              <w:rFonts w:ascii="Times New Roman" w:hAnsi="Times New Roman" w:cs="Times New Roman"/>
+            </w:rPr>
+            <w:t xml:space="preserve">Este documento oficializa la creación de </w:t>
+          </w:r>
+          <w:r>
+            <w:rPr>
+              <w:rFonts w:ascii="Times New Roman" w:hAnsi="Times New Roman" w:cs="Times New Roman"/>
+              <w:b/>
+            </w:rPr>
+            <w:t xml:space="preserve">Lemon SL </w:t>
+          </w:r>
+          <w:r>
+            <w:rPr>
+              <w:rFonts w:ascii="Times New Roman" w:hAnsi="Times New Roman" w:cs="Times New Roman"/>
+            </w:rPr>
+            <w:t>conteniendo información detallada de los socios que componen est</w:t>
+          </w:r>
+          <w:r>
+            <w:rPr>
+              <w:rFonts w:ascii="Times New Roman" w:hAnsi="Times New Roman" w:cs="Times New Roman"/>
+            </w:rPr>
+            <w:t>a, el capital social,</w:t>
+          </w:r>
+          <w:r>
+            <w:rPr>
+              <w:rFonts w:ascii="Times New Roman" w:hAnsi="Times New Roman" w:cs="Times New Roman"/>
+            </w:rPr>
+            <w:t xml:space="preserve"> el objetivo, y los estatutos. La firma de la escritura marca el inicio formal </w:t>
+          </w:r>
+          <w:r>
+            <w:rPr>
+              <w:rFonts w:ascii="Times New Roman" w:hAnsi="Times New Roman" w:cs="Times New Roman"/>
+            </w:rPr>
+            <w:t>del proceso de constitución.</w:t>
+          </w:r>
+          <w:r>
+            <w:rPr>
+              <w:rFonts w:ascii="Times New Roman" w:hAnsi="Times New Roman" w:cs="Times New Roman"/>
+            </w:rPr>
+            <w:t xml:space="preserve"> </w:t>
+          </w:r>
+        </w:p>
+        <w:p>
+          <w:pPr>
+            <w:pStyle w:val="Prrafodelista"/>
+            <w:numPr>
+              <w:ilvl w:val="0"/>
+              <w:numId w:val="7"/>
+            </w:numPr>
+            <w:spacing w:line="360" w:lineRule="auto"/>
+            <w:jc w:val="both"/>
+            <w:rPr>
+              <w:rFonts w:ascii="Times New Roman" w:hAnsi="Times New Roman" w:cs="Times New Roman"/>
+              <w:b/>
+              <w:i/>
+            </w:rPr>
+          </w:pPr>
+          <w:r>
+            <w:rPr>
+              <w:rFonts w:ascii="Times New Roman" w:hAnsi="Times New Roman" w:cs="Times New Roman"/>
+              <w:b/>
+              <w:i/>
+            </w:rPr>
+            <w:t xml:space="preserve">Inscripción en el Registro Mercantil </w:t>
+          </w:r>
+        </w:p>
+        <w:p>
+          <w:pPr>
+            <w:pStyle w:val="Prrafodelista"/>
+            <w:spacing w:line="360" w:lineRule="auto"/>
+            <w:ind w:left="1080"/>
+            <w:jc w:val="both"/>
+            <w:rPr>
+              <w:rFonts w:ascii="Times New Roman" w:hAnsi="Times New Roman" w:cs="Times New Roman"/>
+            </w:rPr>
+          </w:pPr>
+          <w:r>
+            <w:rPr>
+              <w:rFonts w:ascii="Times New Roman" w:hAnsi="Times New Roman" w:cs="Times New Roman"/>
+            </w:rPr>
+            <w:t xml:space="preserve">Firmada la escritura de la constitución, se procederá con </w:t>
+          </w:r>
+          <w:r>
+            <w:rPr>
+              <w:rFonts w:ascii="Times New Roman" w:hAnsi="Times New Roman" w:cs="Times New Roman"/>
+              <w:b/>
+              <w:i/>
+            </w:rPr>
+            <w:t>la inscripción de la sociedad en el Registro Mercantil Provincial</w:t>
+          </w:r>
+          <w:r>
+            <w:rPr>
+              <w:rFonts w:ascii="Times New Roman" w:hAnsi="Times New Roman" w:cs="Times New Roman"/>
+              <w:b/>
+              <w:i/>
+            </w:rPr>
+            <w:t>.</w:t>
+          </w:r>
+          <w:r>
+            <w:rPr>
+              <w:rFonts w:ascii="Times New Roman" w:hAnsi="Times New Roman" w:cs="Times New Roman"/>
+            </w:rPr>
+            <w:t xml:space="preserve"> </w:t>
+          </w:r>
+          <w:r>
+            <w:rPr>
+              <w:rFonts w:ascii="Times New Roman" w:hAnsi="Times New Roman" w:cs="Times New Roman"/>
+            </w:rPr>
+            <w:t>Esta</w:t>
+          </w:r>
+          <w:r>
+            <w:rPr>
+              <w:rFonts w:ascii="Times New Roman" w:hAnsi="Times New Roman" w:cs="Times New Roman"/>
+            </w:rPr>
+            <w:t xml:space="preserve"> inscripción es paso clave, debido a que se le otorgará a </w:t>
+          </w:r>
+          <w:r>
+            <w:rPr>
+              <w:rFonts w:ascii="Times New Roman" w:hAnsi="Times New Roman" w:cs="Times New Roman"/>
+              <w:b/>
+            </w:rPr>
+            <w:t>Lemon SL</w:t>
+          </w:r>
+          <w:r>
+            <w:rPr>
+              <w:rFonts w:ascii="Times New Roman" w:hAnsi="Times New Roman" w:cs="Times New Roman"/>
+            </w:rPr>
+            <w:t xml:space="preserve"> personalidad jurídica plena permitiéndole que opere legalmente.</w:t>
+          </w:r>
+        </w:p>
+        <w:p>
+          <w:pPr>
+            <w:pStyle w:val="Prrafodelista"/>
+            <w:numPr>
+              <w:ilvl w:val="0"/>
+              <w:numId w:val="7"/>
+            </w:numPr>
+            <w:spacing w:line="360" w:lineRule="auto"/>
+            <w:jc w:val="both"/>
+            <w:rPr>
+              <w:rFonts w:ascii="Times New Roman" w:hAnsi="Times New Roman" w:cs="Times New Roman"/>
+              <w:b/>
+              <w:i/>
+            </w:rPr>
+          </w:pPr>
+          <w:r>
+            <w:rPr>
+              <w:rFonts w:ascii="Times New Roman" w:hAnsi="Times New Roman" w:cs="Times New Roman"/>
+              <w:b/>
+              <w:i/>
+            </w:rPr>
+            <w:t>Obtención del Número de Identificación Fiscal</w:t>
+          </w:r>
+          <w:r>
+            <w:rPr>
+              <w:rFonts w:ascii="Times New Roman" w:hAnsi="Times New Roman" w:cs="Times New Roman"/>
+              <w:b/>
+              <w:i/>
+            </w:rPr>
+            <w:t xml:space="preserve"> (NIF) </w:t>
+          </w:r>
+          <w:r>
+            <w:rPr>
+              <w:rFonts w:ascii="Times New Roman" w:hAnsi="Times New Roman" w:cs="Times New Roman"/>
+              <w:b/>
+              <w:i/>
+            </w:rPr>
+            <w:tab/>
+          </w:r>
+          <w:r>
+            <w:rPr>
+              <w:rFonts w:ascii="Times New Roman" w:hAnsi="Times New Roman" w:cs="Times New Roman"/>
+              <w:b/>
+              <w:i/>
+            </w:rPr>
+            <w:tab/>
+          </w:r>
+          <w:bookmarkStart w:id="0" w:name="_GoBack"/>
+          <w:bookmarkEnd w:id="0"/>
+        </w:p>
+        <w:p>
+          <w:pPr>
+            <w:pStyle w:val="Prrafodelista"/>
+            <w:spacing w:line="360" w:lineRule="auto"/>
+            <w:ind w:left="1080"/>
+            <w:jc w:val="both"/>
+            <w:rPr>
+              <w:rFonts w:ascii="Times New Roman" w:hAnsi="Times New Roman" w:cs="Times New Roman"/>
+            </w:rPr>
+          </w:pPr>
+          <w:r>
+            <w:rPr>
+              <w:rFonts w:ascii="Times New Roman" w:hAnsi="Times New Roman" w:cs="Times New Roman"/>
+            </w:rPr>
+            <w:t xml:space="preserve">Teniendo </w:t>
+          </w:r>
+          <w:r>
+            <w:rPr>
+              <w:rFonts w:ascii="Times New Roman" w:hAnsi="Times New Roman" w:cs="Times New Roman"/>
+            </w:rPr>
+            <w:t xml:space="preserve">firmada </w:t>
+          </w:r>
+          <w:r>
+            <w:rPr>
+              <w:rFonts w:ascii="Times New Roman" w:hAnsi="Times New Roman" w:cs="Times New Roman"/>
+            </w:rPr>
+            <w:t>la escritura</w:t>
+          </w:r>
+          <w:r>
+            <w:rPr>
+              <w:rFonts w:ascii="Times New Roman" w:hAnsi="Times New Roman" w:cs="Times New Roman"/>
+            </w:rPr>
+            <w:t xml:space="preserve">, </w:t>
+          </w:r>
+          <w:r>
+            <w:rPr>
+              <w:rFonts w:ascii="Times New Roman" w:hAnsi="Times New Roman" w:cs="Times New Roman"/>
+              <w:b/>
+            </w:rPr>
+            <w:t>Lemon SL</w:t>
+          </w:r>
+          <w:r>
+            <w:rPr>
+              <w:rFonts w:ascii="Times New Roman" w:hAnsi="Times New Roman" w:cs="Times New Roman"/>
+            </w:rPr>
+            <w:t xml:space="preserve"> deberá solicitar </w:t>
+          </w:r>
+          <w:r>
+            <w:rPr>
+              <w:rFonts w:ascii="Times New Roman" w:hAnsi="Times New Roman" w:cs="Times New Roman"/>
+            </w:rPr>
+            <w:t xml:space="preserve">el NIF en la Agencia Tributaria. </w:t>
+          </w:r>
+          <w:r>
+            <w:rPr>
+              <w:rFonts w:ascii="Times New Roman" w:hAnsi="Times New Roman" w:cs="Times New Roman"/>
+            </w:rPr>
+            <w:t>Este NIF provisional permitirá a la Lemon operar durante el proceso de constitución</w:t>
+          </w:r>
+          <w:r>
+            <w:rPr>
+              <w:rFonts w:ascii="Times New Roman" w:hAnsi="Times New Roman" w:cs="Times New Roman"/>
+            </w:rPr>
+            <w:t xml:space="preserve">. </w:t>
+          </w:r>
+          <w:r>
+            <w:rPr>
+              <w:rFonts w:ascii="Times New Roman" w:hAnsi="Times New Roman" w:cs="Times New Roman"/>
+            </w:rPr>
+            <w:t xml:space="preserve">Finalizada la inscripción en el Registro Mercantil se emitirá el NIF </w:t>
+          </w:r>
+          <w:r>
+            <w:rPr>
+              <w:rFonts w:ascii="Times New Roman" w:hAnsi="Times New Roman" w:cs="Times New Roman"/>
+            </w:rPr>
+            <w:lastRenderedPageBreak/>
+            <w:t xml:space="preserve">definitivo. Con este Lemon podrá realizar todas las actividades </w:t>
+          </w:r>
+          <w:r>
+            <w:rPr>
+              <w:rFonts w:ascii="Times New Roman" w:hAnsi="Times New Roman" w:cs="Times New Roman"/>
+            </w:rPr>
+            <w:t>comerciales y fiscales.</w:t>
+          </w:r>
+          <w:r>
+            <w:rPr>
+              <w:rFonts w:ascii="Times New Roman" w:hAnsi="Times New Roman" w:cs="Times New Roman"/>
+            </w:rPr>
+            <w:t xml:space="preserve"> </w:t>
+          </w:r>
+        </w:p>
+        <w:p>
+          <w:pPr>
+            <w:pStyle w:val="Prrafodelista"/>
+            <w:numPr>
+              <w:ilvl w:val="0"/>
+              <w:numId w:val="7"/>
+            </w:numPr>
+            <w:spacing w:line="360" w:lineRule="auto"/>
+            <w:jc w:val="both"/>
+            <w:rPr>
+              <w:rFonts w:ascii="Times New Roman" w:hAnsi="Times New Roman" w:cs="Times New Roman"/>
+              <w:b/>
+              <w:i/>
+            </w:rPr>
+          </w:pPr>
+          <w:r>
+            <w:rPr>
+              <w:rFonts w:ascii="Times New Roman" w:hAnsi="Times New Roman" w:cs="Times New Roman"/>
+              <w:b/>
+              <w:i/>
+            </w:rPr>
+            <w:t>Alta en el Impuesto sobre Actividades Económicas</w:t>
+          </w:r>
+          <w:r>
+            <w:rPr>
+              <w:rFonts w:ascii="Times New Roman" w:hAnsi="Times New Roman" w:cs="Times New Roman"/>
+              <w:b/>
+              <w:i/>
+            </w:rPr>
+            <w:t xml:space="preserve"> (IAE) </w:t>
+          </w:r>
+        </w:p>
+        <w:p>
+          <w:pPr>
+            <w:pStyle w:val="Prrafodelista"/>
+            <w:spacing w:line="360" w:lineRule="auto"/>
+            <w:ind w:left="1080"/>
+            <w:jc w:val="both"/>
+            <w:rPr>
+              <w:rFonts w:ascii="Times New Roman" w:hAnsi="Times New Roman" w:cs="Times New Roman"/>
+              <w:b/>
+              <w:i/>
+            </w:rPr>
+          </w:pPr>
+        </w:p>
+        <w:p>
+          <w:pPr>
+            <w:pStyle w:val="Prrafodelista"/>
+            <w:numPr>
+              <w:ilvl w:val="0"/>
+              <w:numId w:val="7"/>
+            </w:numPr>
+            <w:spacing w:line="360" w:lineRule="auto"/>
+            <w:jc w:val="both"/>
+            <w:rPr>
+              <w:rFonts w:ascii="Times New Roman" w:hAnsi="Times New Roman" w:cs="Times New Roman"/>
+              <w:b/>
+              <w:i/>
+            </w:rPr>
+          </w:pPr>
+          <w:r>
+            <w:rPr>
+              <w:rFonts w:ascii="Times New Roman" w:hAnsi="Times New Roman" w:cs="Times New Roman"/>
+              <w:b/>
+              <w:i/>
+            </w:rPr>
+            <w:t>Inscripción en la Seguridad Social</w:t>
+          </w:r>
+        </w:p>
+        <w:p>
+          <w:pPr>
+            <w:pStyle w:val="Prrafodelista"/>
+            <w:spacing w:line="360" w:lineRule="auto"/>
+            <w:ind w:left="1080"/>
+            <w:jc w:val="both"/>
+            <w:rPr>
+              <w:rFonts w:ascii="Times New Roman" w:hAnsi="Times New Roman" w:cs="Times New Roman"/>
+              <w:b/>
+              <w:i/>
+            </w:rPr>
+          </w:pPr>
+        </w:p>
+        <w:p>
+          <w:pPr>
+            <w:pStyle w:val="Prrafodelista"/>
+            <w:numPr>
+              <w:ilvl w:val="0"/>
+              <w:numId w:val="7"/>
+            </w:numPr>
+            <w:spacing w:line="360" w:lineRule="auto"/>
+            <w:jc w:val="both"/>
+            <w:rPr>
+              <w:rFonts w:ascii="Times New Roman" w:hAnsi="Times New Roman" w:cs="Times New Roman"/>
+              <w:b/>
+              <w:i/>
+            </w:rPr>
+          </w:pPr>
+          <w:r>
+            <w:rPr>
+              <w:rFonts w:ascii="Times New Roman" w:hAnsi="Times New Roman" w:cs="Times New Roman"/>
+              <w:b/>
+              <w:i/>
+            </w:rPr>
+            <w:t>Obtención de Licencias y Permisos</w:t>
+          </w:r>
+        </w:p>
+        <w:p>
+          <w:pPr>
+            <w:pStyle w:val="Prrafodelista"/>
+            <w:spacing w:line="360" w:lineRule="auto"/>
+            <w:ind w:left="1080"/>
+            <w:jc w:val="both"/>
+            <w:rPr>
+              <w:rFonts w:ascii="Times New Roman" w:hAnsi="Times New Roman" w:cs="Times New Roman"/>
+              <w:b/>
+              <w:i/>
+            </w:rPr>
+          </w:pPr>
+        </w:p>
+        <w:p>
+          <w:pPr>
+            <w:pStyle w:val="Prrafodelista"/>
+            <w:numPr>
+              <w:ilvl w:val="0"/>
+              <w:numId w:val="7"/>
+            </w:numPr>
+            <w:spacing w:line="360" w:lineRule="auto"/>
+            <w:jc w:val="both"/>
+            <w:rPr>
+              <w:rFonts w:ascii="Times New Roman" w:hAnsi="Times New Roman" w:cs="Times New Roman"/>
+            </w:rPr>
+          </w:pPr>
+          <w:r>
+            <w:rPr>
+              <w:rFonts w:ascii="Times New Roman" w:hAnsi="Times New Roman" w:cs="Times New Roman"/>
+              <w:b/>
+              <w:i/>
+            </w:rPr>
+            <w:t>Inicio de la Actividad Empresarial</w:t>
+          </w:r>
+        </w:p>
       </w:sdtContent>
     </w:sdt>
     <w:sectPr>
@@ -684,6 +1424,95 @@
 <file path=word/numbering.xml><?xml version="1.0" encoding="utf-8"?>
 <w:numbering xmlns:wpc="http://schemas.microsoft.com/office/word/2010/wordprocessingCanvas" xmlns:cx="http://schemas.microsoft.com/office/drawing/2014/chartex" xmlns:cx1="http://schemas.microsoft.com/office/drawing/2015/9/8/chartex" xmlns:cx2="http://schemas.microsoft.com/office/drawing/2015/10/21/chartex" xmlns:cx3="http://schemas.microsoft.com/office/drawing/2016/5/9/chartex" xmlns:cx4="http://schemas.microsoft.com/office/drawing/2016/5/10/chartex" xmlns:cx5="http://schemas.microsoft.com/office/drawing/2016/5/11/chartex" xmlns:cx6="http://schemas.microsoft.com/office/drawing/2016/5/12/chartex" xmlns:cx7="http://schemas.microsoft.com/office/drawing/2016/5/13/chartex" xmlns:cx8="http://schemas.microsoft.com/office/drawing/2016/5/14/chartex" xmlns:mc="http://schemas.openxmlformats.org/markup-compatibility/2006" xmlns:aink="http://schemas.microsoft.com/office/drawing/2016/ink" xmlns:am3d="http://schemas.microsoft.com/office/drawing/2017/model3d" xmlns:o="urn:schemas-microsoft-com:office:office" xmlns:r="http://schemas.openxmlformats.org/officeDocument/2006/relationships" xmlns:m="http://schemas.openxmlformats.org/officeDocument/2006/math" xmlns:v="urn:schemas-microsoft-com:vml" xmlns:wp14="http://schemas.microsoft.com/office/word/2010/wordprocessingDrawing" xmlns:wp="http://schemas.openxmlformats.org/drawingml/2006/wordprocessingDrawing" xmlns:w10="urn:schemas-microsoft-com:office:word" xmlns:w="http://schemas.openxmlformats.org/wordprocessingml/2006/main" xmlns:w14="http://schemas.microsoft.com/office/word/2010/wordml" xmlns:w15="http://schemas.microsoft.com/office/word/2012/wordml" xmlns:w16cid="http://schemas.microsoft.com/office/word/2016/wordml/cid" xmlns:w16se="http://schemas.microsoft.com/office/word/2015/wordml/symex" xmlns:wpg="http://schemas.microsoft.com/office/word/2010/wordprocessingGroup" xmlns:wpi="http://schemas.microsoft.com/office/word/2010/wordprocessingInk" xmlns:wne="http://schemas.microsoft.com/office/word/2006/wordml" xmlns:wps="http://schemas.microsoft.com/office/word/2010/wordprocessingShape" mc:Ignorable="w14 w15 w16se w16cid wp14">
   <w:abstractNum w:abstractNumId="0" w15:restartNumberingAfterBreak="0">
+    <w:nsid w:val="141A566D"/>
+    <w:multiLevelType w:val="hybridMultilevel"/>
+    <w:tmpl w:val="70B42E0C"/>
+    <w:lvl w:ilvl="0" w:tplc="97E24F08">
+      <w:start w:val="1"/>
+      <w:numFmt w:val="decimal"/>
+      <w:lvlText w:val="%1."/>
+      <w:lvlJc w:val="left"/>
+      <w:pPr>
+        <w:ind w:left="1080" w:hanging="360"/>
+      </w:pPr>
+      <w:rPr>
+        <w:rFonts w:hint="default"/>
+      </w:rPr>
+    </w:lvl>
+    <w:lvl w:ilvl="1" w:tplc="0C0A0019" w:tentative="1">
+      <w:start w:val="1"/>
+      <w:numFmt w:val="lowerLetter"/>
+      <w:lvlText w:val="%2."/>
+      <w:lvlJc w:val="left"/>
+      <w:pPr>
+        <w:ind w:left="1800" w:hanging="360"/>
+      </w:pPr>
+    </w:lvl>
+    <w:lvl w:ilvl="2" w:tplc="0C0A001B" w:tentative="1">
+      <w:start w:val="1"/>
+      <w:numFmt w:val="lowerRoman"/>
+      <w:lvlText w:val="%3."/>
+      <w:lvlJc w:val="right"/>
+      <w:pPr>
+        <w:ind w:left="2520" w:hanging="180"/>
+      </w:pPr>
+    </w:lvl>
+    <w:lvl w:ilvl="3" w:tplc="0C0A000F" w:tentative="1">
+      <w:start w:val="1"/>
+      <w:numFmt w:val="decimal"/>
+      <w:lvlText w:val="%4."/>
+      <w:lvlJc w:val="left"/>
+      <w:pPr>
+        <w:ind w:left="3240" w:hanging="360"/>
+      </w:pPr>
+    </w:lvl>
+    <w:lvl w:ilvl="4" w:tplc="0C0A0019" w:tentative="1">
+      <w:start w:val="1"/>
+      <w:numFmt w:val="lowerLetter"/>
+      <w:lvlText w:val="%5."/>
+      <w:lvlJc w:val="left"/>
+      <w:pPr>
+        <w:ind w:left="3960" w:hanging="360"/>
+      </w:pPr>
+    </w:lvl>
+    <w:lvl w:ilvl="5" w:tplc="0C0A001B" w:tentative="1">
+      <w:start w:val="1"/>
+      <w:numFmt w:val="lowerRoman"/>
+      <w:lvlText w:val="%6."/>
+      <w:lvlJc w:val="right"/>
+      <w:pPr>
+        <w:ind w:left="4680" w:hanging="180"/>
+      </w:pPr>
+    </w:lvl>
+    <w:lvl w:ilvl="6" w:tplc="0C0A000F" w:tentative="1">
+      <w:start w:val="1"/>
+      <w:numFmt w:val="decimal"/>
+      <w:lvlText w:val="%7."/>
+      <w:lvlJc w:val="left"/>
+      <w:pPr>
+        <w:ind w:left="5400" w:hanging="360"/>
+      </w:pPr>
+    </w:lvl>
+    <w:lvl w:ilvl="7" w:tplc="0C0A0019" w:tentative="1">
+      <w:start w:val="1"/>
+      <w:numFmt w:val="lowerLetter"/>
+      <w:lvlText w:val="%8."/>
+      <w:lvlJc w:val="left"/>
+      <w:pPr>
+        <w:ind w:left="6120" w:hanging="360"/>
+      </w:pPr>
+    </w:lvl>
+    <w:lvl w:ilvl="8" w:tplc="0C0A001B" w:tentative="1">
+      <w:start w:val="1"/>
+      <w:numFmt w:val="lowerRoman"/>
+      <w:lvlText w:val="%9."/>
+      <w:lvlJc w:val="right"/>
+      <w:pPr>
+        <w:ind w:left="6840" w:hanging="180"/>
+      </w:pPr>
+    </w:lvl>
+  </w:abstractNum>
+  <w:abstractNum w:abstractNumId="1" w15:restartNumberingAfterBreak="0">
     <w:nsid w:val="41FD4EE2"/>
     <w:multiLevelType w:val="hybridMultilevel"/>
     <w:tmpl w:val="759C628E"/>
@@ -772,7 +1601,7 @@
       </w:pPr>
     </w:lvl>
   </w:abstractNum>
-  <w:abstractNum w:abstractNumId="1" w15:restartNumberingAfterBreak="0">
+  <w:abstractNum w:abstractNumId="2" w15:restartNumberingAfterBreak="0">
     <w:nsid w:val="42D65B36"/>
     <w:multiLevelType w:val="hybridMultilevel"/>
     <w:tmpl w:val="4D48175E"/>
@@ -885,7 +1714,7 @@
       </w:rPr>
     </w:lvl>
   </w:abstractNum>
-  <w:abstractNum w:abstractNumId="2" w15:restartNumberingAfterBreak="0">
+  <w:abstractNum w:abstractNumId="3" w15:restartNumberingAfterBreak="0">
     <w:nsid w:val="52781A23"/>
     <w:multiLevelType w:val="hybridMultilevel"/>
     <w:tmpl w:val="1B749EB0"/>
@@ -974,7 +1803,7 @@
       </w:pPr>
     </w:lvl>
   </w:abstractNum>
-  <w:abstractNum w:abstractNumId="3" w15:restartNumberingAfterBreak="0">
+  <w:abstractNum w:abstractNumId="4" w15:restartNumberingAfterBreak="0">
     <w:nsid w:val="56246645"/>
     <w:multiLevelType w:val="hybridMultilevel"/>
     <w:tmpl w:val="47BEC7DA"/>
@@ -1063,7 +1892,7 @@
       </w:pPr>
     </w:lvl>
   </w:abstractNum>
-  <w:abstractNum w:abstractNumId="4" w15:restartNumberingAfterBreak="0">
+  <w:abstractNum w:abstractNumId="5" w15:restartNumberingAfterBreak="0">
     <w:nsid w:val="5DA43964"/>
     <w:multiLevelType w:val="hybridMultilevel"/>
     <w:tmpl w:val="3CD2BBC2"/>
@@ -1152,7 +1981,7 @@
       </w:pPr>
     </w:lvl>
   </w:abstractNum>
-  <w:abstractNum w:abstractNumId="5" w15:restartNumberingAfterBreak="0">
+  <w:abstractNum w:abstractNumId="6" w15:restartNumberingAfterBreak="0">
     <w:nsid w:val="78E83916"/>
     <w:multiLevelType w:val="hybridMultilevel"/>
     <w:tmpl w:val="42F657D4"/>
@@ -1242,22 +2071,25 @@
     </w:lvl>
   </w:abstractNum>
   <w:num w:numId="1">
+    <w:abstractNumId w:val="6"/>
+  </w:num>
+  <w:num w:numId="2">
+    <w:abstractNumId w:val="4"/>
+  </w:num>
+  <w:num w:numId="3">
     <w:abstractNumId w:val="5"/>
   </w:num>
-  <w:num w:numId="2">
+  <w:num w:numId="4">
+    <w:abstractNumId w:val="1"/>
+  </w:num>
+  <w:num w:numId="5">
+    <w:abstractNumId w:val="2"/>
+  </w:num>
+  <w:num w:numId="6">
     <w:abstractNumId w:val="3"/>
   </w:num>
-  <w:num w:numId="3">
-    <w:abstractNumId w:val="4"/>
-  </w:num>
-  <w:num w:numId="4">
+  <w:num w:numId="7">
     <w:abstractNumId w:val="0"/>
-  </w:num>
-  <w:num w:numId="5">
-    <w:abstractNumId w:val="1"/>
-  </w:num>
-  <w:num w:numId="6">
-    <w:abstractNumId w:val="2"/>
   </w:num>
 </w:numbering>
 </file>
@@ -1811,7 +2643,7 @@
     <w:charset w:val="00"/>
     <w:family w:val="swiss"/>
     <w:pitch w:val="variable"/>
-    <w:sig w:usb0="E4002EFF" w:usb1="C000247B" w:usb2="00000009" w:usb3="00000000" w:csb0="000001FF" w:csb1="00000000"/>
+    <w:sig w:usb0="E4002EFF" w:usb1="C200247B" w:usb2="00000009" w:usb3="00000000" w:csb0="000001FF" w:csb1="00000000"/>
   </w:font>
   <w:font w:name="Courier New">
     <w:panose1 w:val="02070309020205020404"/>
@@ -1839,7 +2671,7 @@
     <w:charset w:val="00"/>
     <w:family w:val="swiss"/>
     <w:pitch w:val="variable"/>
-    <w:sig w:usb0="E4002EFF" w:usb1="C000247B" w:usb2="00000009" w:usb3="00000000" w:csb0="000001FF" w:csb1="00000000"/>
+    <w:sig w:usb0="E4002EFF" w:usb1="C200247B" w:usb2="00000009" w:usb3="00000000" w:csb0="000001FF" w:csb1="00000000"/>
   </w:font>
 </w:fonts>
 </file>

</xml_diff>